<commit_message>
Ids fixed in documents
</commit_message>
<xml_diff>
--- a/documents/project-structure/estructura-servicios.docx
+++ b/documents/project-structure/estructura-servicios.docx
@@ -93,7 +93,7 @@
     </w:p>
     <w:sdt>
       <w:sdtPr>
-        <w:id w:val="-833528556"/>
+        <w:id w:val="-2119045615"/>
         <w:docPartObj>
           <w:docPartGallery w:val="Table of Contents"/>
           <w:docPartUnique w:val="1"/>
@@ -128,7 +128,7 @@
             <w:instrText xml:space="preserve"> TOC \h \u \z \t "Heading 1,1,Heading 2,2,"</w:instrText>
             <w:fldChar w:fldCharType="separate"/>
           </w:r>
-          <w:hyperlink w:anchor="_7ihy4ecnucvz">
+          <w:hyperlink w:anchor="_wd2x4sk6m730">
             <w:r>
               <w:rPr>
                 <w:rFonts w:ascii="Arial" w:cs="Arial" w:eastAsia="Arial" w:hAnsi="Arial"/>
@@ -181,7 +181,7 @@
               <w:vertAlign w:val="baseline"/>
             </w:rPr>
           </w:pPr>
-          <w:hyperlink w:anchor="_4bgftsadnbya">
+          <w:hyperlink w:anchor="_smywdl5nbrn6">
             <w:r>
               <w:rPr>
                 <w:rFonts w:ascii="Arial" w:cs="Arial" w:eastAsia="Arial" w:hAnsi="Arial"/>
@@ -234,7 +234,7 @@
               <w:vertAlign w:val="baseline"/>
             </w:rPr>
           </w:pPr>
-          <w:hyperlink w:anchor="_afpx4gh01n9">
+          <w:hyperlink w:anchor="_zg4gcprl5ly7">
             <w:r>
               <w:rPr>
                 <w:rFonts w:ascii="Arial" w:cs="Arial" w:eastAsia="Arial" w:hAnsi="Arial"/>
@@ -287,7 +287,7 @@
               <w:vertAlign w:val="baseline"/>
             </w:rPr>
           </w:pPr>
-          <w:hyperlink w:anchor="_uzu4o79ksclx">
+          <w:hyperlink w:anchor="_t1p4e7it0pgw">
             <w:r>
               <w:rPr>
                 <w:rFonts w:ascii="Arial" w:cs="Arial" w:eastAsia="Arial" w:hAnsi="Arial"/>
@@ -339,7 +339,7 @@
               <w:vertAlign w:val="baseline"/>
             </w:rPr>
           </w:pPr>
-          <w:hyperlink w:anchor="_jhuoszyjjv22">
+          <w:hyperlink w:anchor="_gd0u4kx7lh16">
             <w:r>
               <w:rPr>
                 <w:rFonts w:ascii="Arial" w:cs="Arial" w:eastAsia="Arial" w:hAnsi="Arial"/>
@@ -391,7 +391,7 @@
               <w:vertAlign w:val="baseline"/>
             </w:rPr>
           </w:pPr>
-          <w:hyperlink w:anchor="_ddt9mhp734wd">
+          <w:hyperlink w:anchor="_itzfs6sz74n2">
             <w:r>
               <w:rPr>
                 <w:rFonts w:ascii="Arial" w:cs="Arial" w:eastAsia="Arial" w:hAnsi="Arial"/>
@@ -443,7 +443,7 @@
               <w:vertAlign w:val="baseline"/>
             </w:rPr>
           </w:pPr>
-          <w:hyperlink w:anchor="_3dwwdrpzj58e">
+          <w:hyperlink w:anchor="_azh2lau2qkws">
             <w:r>
               <w:rPr>
                 <w:rFonts w:ascii="Arial" w:cs="Arial" w:eastAsia="Arial" w:hAnsi="Arial"/>
@@ -495,7 +495,7 @@
               <w:vertAlign w:val="baseline"/>
             </w:rPr>
           </w:pPr>
-          <w:hyperlink w:anchor="_f8x6mcvr4qtu">
+          <w:hyperlink w:anchor="_vyesjjhypkqi">
             <w:r>
               <w:rPr>
                 <w:rFonts w:ascii="Arial" w:cs="Arial" w:eastAsia="Arial" w:hAnsi="Arial"/>
@@ -547,7 +547,7 @@
               <w:vertAlign w:val="baseline"/>
             </w:rPr>
           </w:pPr>
-          <w:hyperlink w:anchor="_xyz3pcezext6">
+          <w:hyperlink w:anchor="_2eq57qwhv8gm">
             <w:r>
               <w:rPr>
                 <w:rFonts w:ascii="Arial" w:cs="Arial" w:eastAsia="Arial" w:hAnsi="Arial"/>
@@ -599,7 +599,7 @@
               <w:vertAlign w:val="baseline"/>
             </w:rPr>
           </w:pPr>
-          <w:hyperlink w:anchor="_4uxuz1tiw5hn">
+          <w:hyperlink w:anchor="_c293sqxmr4jr">
             <w:r>
               <w:rPr>
                 <w:rFonts w:ascii="Arial" w:cs="Arial" w:eastAsia="Arial" w:hAnsi="Arial"/>
@@ -651,7 +651,7 @@
               <w:vertAlign w:val="baseline"/>
             </w:rPr>
           </w:pPr>
-          <w:hyperlink w:anchor="_8hxe523taxia">
+          <w:hyperlink w:anchor="_xyfnki45mt04">
             <w:r>
               <w:rPr>
                 <w:rFonts w:ascii="Arial" w:cs="Arial" w:eastAsia="Arial" w:hAnsi="Arial"/>
@@ -703,7 +703,7 @@
               <w:vertAlign w:val="baseline"/>
             </w:rPr>
           </w:pPr>
-          <w:hyperlink w:anchor="_be6qgmc86m5e">
+          <w:hyperlink w:anchor="_1utoskyronph">
             <w:r>
               <w:rPr>
                 <w:rFonts w:ascii="Arial" w:cs="Arial" w:eastAsia="Arial" w:hAnsi="Arial"/>
@@ -818,7 +818,7 @@
         <w:spacing w:after="120" w:before="0" w:lineRule="auto"/>
         <w:rPr/>
       </w:pPr>
-      <w:bookmarkStart w:colFirst="0" w:colLast="0" w:name="_7ihy4ecnucvz" w:id="0"/>
+      <w:bookmarkStart w:colFirst="0" w:colLast="0" w:name="_wd2x4sk6m730" w:id="0"/>
       <w:bookmarkEnd w:id="0"/>
       <w:r>
         <w:rPr>
@@ -869,7 +869,7 @@
         <w:spacing w:after="100" w:before="300" w:lineRule="auto"/>
         <w:rPr/>
       </w:pPr>
-      <w:bookmarkStart w:colFirst="0" w:colLast="0" w:name="_4bgftsadnbya" w:id="1"/>
+      <w:bookmarkStart w:colFirst="0" w:colLast="0" w:name="_smywdl5nbrn6" w:id="1"/>
       <w:bookmarkEnd w:id="1"/>
       <w:r>
         <w:rPr>
@@ -1230,7 +1230,7 @@
         <w:spacing w:after="100" w:before="300" w:lineRule="auto"/>
         <w:rPr/>
       </w:pPr>
-      <w:bookmarkStart w:colFirst="0" w:colLast="0" w:name="_afpx4gh01n9" w:id="2"/>
+      <w:bookmarkStart w:colFirst="0" w:colLast="0" w:name="_zg4gcprl5ly7" w:id="2"/>
       <w:bookmarkEnd w:id="2"/>
       <w:r>
         <w:rPr>
@@ -1474,6 +1474,30 @@
     </w:p>
     <w:p>
       <w:pPr>
+        <w:shd w:fill="fff8dc" w:val="clear"/>
+        <w:spacing w:after="30" w:before="30" w:lineRule="auto"/>
+        <w:ind w:left="360" w:firstLine="0"/>
+        <w:rPr/>
+      </w:pPr>
+      <w:r>
+        <w:rPr>
+          <w:i w:val="1"/>
+          <w:iCs w:val="1"/>
+          <w:color w:val="444444"/>
+          <w:sz w:val="17"/>
+          <w:szCs w:val="17"/>
+          <w:rtl w:val="0"/>
+        </w:rPr>
+        <w:t xml:space="preserve">Identificadores: todas las claves primarias de entidad son BIGINT en MySQL y se mapean a Long en Java (entidades, DTOs y firmas de los servicios). Por eso los parámetros y campos de id usan Long, no int; los valores no-id (p. ej. rating, dayOfWeek) siguen siendo int.</w:t>
+      </w:r>
+      <w:r>
+        <w:rPr>
+          <w:rtl w:val="0"/>
+        </w:rPr>
+      </w:r>
+    </w:p>
+    <w:p>
+      <w:pPr>
         <w:shd w:fill="eafaf1" w:val="clear"/>
         <w:spacing w:after="30" w:before="30" w:lineRule="auto"/>
         <w:ind w:left="360" w:firstLine="0"/>
@@ -1940,7 +1964,7 @@
         <w:spacing w:after="100" w:before="300" w:lineRule="auto"/>
         <w:rPr/>
       </w:pPr>
-      <w:bookmarkStart w:colFirst="0" w:colLast="0" w:name="_uzu4o79ksclx" w:id="3"/>
+      <w:bookmarkStart w:colFirst="0" w:colLast="0" w:name="_t1p4e7it0pgw" w:id="3"/>
       <w:bookmarkEnd w:id="3"/>
       <w:r>
         <w:rPr>
@@ -2888,7 +2912,7 @@
         <w:spacing w:after="120" w:before="360" w:lineRule="auto"/>
         <w:rPr/>
       </w:pPr>
-      <w:bookmarkStart w:colFirst="0" w:colLast="0" w:name="_jhuoszyjjv22" w:id="4"/>
+      <w:bookmarkStart w:colFirst="0" w:colLast="0" w:name="_gd0u4kx7lh16" w:id="4"/>
       <w:bookmarkEnd w:id="4"/>
       <w:r>
         <w:rPr>
@@ -3187,7 +3211,7 @@
                 <w:szCs w:val="16"/>
                 <w:rtl w:val="0"/>
               </w:rPr>
-              <w:t xml:space="preserve">void changePassword(int userId, String currentRaw, String newRaw)</w:t>
+              <w:t xml:space="preserve">void changePassword(Long userId, String currentRaw, String newRaw)</w:t>
             </w:r>
             <w:r>
               <w:rPr>
@@ -3263,7 +3287,7 @@
                 <w:szCs w:val="16"/>
                 <w:rtl w:val="0"/>
               </w:rPr>
-              <w:t xml:space="preserve">void changeEmail(int userId, String newEmail)</w:t>
+              <w:t xml:space="preserve">void changeEmail(Long userId, String newEmail)</w:t>
             </w:r>
             <w:r>
               <w:rPr>
@@ -3339,7 +3363,7 @@
                 <w:szCs w:val="16"/>
                 <w:rtl w:val="0"/>
               </w:rPr>
-              <w:t xml:space="preserve">void banUser(int userId)</w:t>
+              <w:t xml:space="preserve">void banUser(Long userId)</w:t>
             </w:r>
             <w:r>
               <w:rPr>
@@ -3415,7 +3439,7 @@
                 <w:szCs w:val="16"/>
                 <w:rtl w:val="0"/>
               </w:rPr>
-              <w:t xml:space="preserve">void unbanUser(int userId)</w:t>
+              <w:t xml:space="preserve">void unbanUser(Long userId)</w:t>
             </w:r>
             <w:r>
               <w:rPr>
@@ -4211,7 +4235,7 @@
                 <w:szCs w:val="16"/>
                 <w:rtl w:val="0"/>
               </w:rPr>
-              <w:t xml:space="preserve">void deleteUser(int userId)</w:t>
+              <w:t xml:space="preserve">void deleteUser(Long userId)</w:t>
             </w:r>
             <w:r>
               <w:rPr>
@@ -4973,7 +4997,7 @@
                 <w:szCs w:val="16"/>
                 <w:rtl w:val="0"/>
               </w:rPr>
-              <w:t xml:space="preserve">List&lt;Role&gt; getUserRoles(int userId)</w:t>
+              <w:t xml:space="preserve">List&lt;Role&gt; getUserRoles(Long userId)</w:t>
             </w:r>
             <w:r>
               <w:rPr>
@@ -5049,7 +5073,7 @@
                 <w:szCs w:val="16"/>
                 <w:rtl w:val="0"/>
               </w:rPr>
-              <w:t xml:space="preserve">boolean hasRole(int userId, String roleName)</w:t>
+              <w:t xml:space="preserve">boolean hasRole(Long userId, String roleName)</w:t>
             </w:r>
             <w:r>
               <w:rPr>
@@ -5125,7 +5149,7 @@
                 <w:szCs w:val="16"/>
                 <w:rtl w:val="0"/>
               </w:rPr>
-              <w:t xml:space="preserve">void assignRole(int userId, int roleId)</w:t>
+              <w:t xml:space="preserve">void assignRole(Long userId, Long roleId)</w:t>
             </w:r>
             <w:r>
               <w:rPr>
@@ -5201,7 +5225,7 @@
                 <w:szCs w:val="16"/>
                 <w:rtl w:val="0"/>
               </w:rPr>
-              <w:t xml:space="preserve">void removeRole(int userId, int roleId)</w:t>
+              <w:t xml:space="preserve">void removeRole(Long userId, Long roleId)</w:t>
             </w:r>
             <w:r>
               <w:rPr>
@@ -5273,7 +5297,7 @@
                 <w:szCs w:val="16"/>
                 <w:rtl w:val="0"/>
               </w:rPr>
-              <w:t xml:space="preserve">void acquireRole(int userId, String roleName)</w:t>
+              <w:t xml:space="preserve">void acquireRole(Long userId, String roleName)</w:t>
             </w:r>
             <w:r>
               <w:rPr>
@@ -5469,7 +5493,7 @@
                 <w:szCs w:val="16"/>
                 <w:rtl w:val="0"/>
               </w:rPr>
-              <w:t xml:space="preserve">Consent createConsent(int userId, boolean accepted)</w:t>
+              <w:t xml:space="preserve">Consent createConsent(Long userId, boolean accepted)</w:t>
             </w:r>
             <w:r>
               <w:rPr>
@@ -5545,7 +5569,7 @@
                 <w:szCs w:val="16"/>
                 <w:rtl w:val="0"/>
               </w:rPr>
-              <w:t xml:space="preserve">boolean hasConsented(int userId)</w:t>
+              <w:t xml:space="preserve">boolean hasConsented(Long userId)</w:t>
             </w:r>
             <w:r>
               <w:rPr>
@@ -5829,7 +5853,7 @@
                 <w:szCs w:val="16"/>
                 <w:rtl w:val="0"/>
               </w:rPr>
-              <w:t xml:space="preserve">PasswordResetToken createToken(int userId)</w:t>
+              <w:t xml:space="preserve">PasswordResetToken createToken(Long userId)</w:t>
             </w:r>
             <w:r>
               <w:rPr>
@@ -5905,7 +5929,7 @@
                 <w:szCs w:val="16"/>
                 <w:rtl w:val="0"/>
               </w:rPr>
-              <w:t xml:space="preserve">TokenValidationResult validateToken(int userId, String rawToken)</w:t>
+              <w:t xml:space="preserve">TokenValidationResult validateToken(Long userId, String rawToken)</w:t>
             </w:r>
             <w:r>
               <w:rPr>
@@ -5981,7 +6005,7 @@
                 <w:szCs w:val="16"/>
                 <w:rtl w:val="0"/>
               </w:rPr>
-              <w:t xml:space="preserve">void markTokenAsUsed(int tokenId)</w:t>
+              <w:t xml:space="preserve">void markTokenAsUsed(Long tokenId)</w:t>
             </w:r>
             <w:r>
               <w:rPr>
@@ -6044,7 +6068,7 @@
         <w:spacing w:after="120" w:before="360" w:lineRule="auto"/>
         <w:rPr/>
       </w:pPr>
-      <w:bookmarkStart w:colFirst="0" w:colLast="0" w:name="_ddt9mhp734wd" w:id="5"/>
+      <w:bookmarkStart w:colFirst="0" w:colLast="0" w:name="_itzfs6sz74n2" w:id="5"/>
       <w:bookmarkEnd w:id="5"/>
       <w:r>
         <w:rPr>
@@ -6267,7 +6291,7 @@
                 <w:szCs w:val="16"/>
                 <w:rtl w:val="0"/>
               </w:rPr>
-              <w:t xml:space="preserve">UserProfileDTO getProfileInfo(int userId)</w:t>
+              <w:t xml:space="preserve">UserProfileDTO getProfileInfo(Long userId)</w:t>
             </w:r>
             <w:r>
               <w:rPr>
@@ -6343,7 +6367,7 @@
                 <w:szCs w:val="16"/>
                 <w:rtl w:val="0"/>
               </w:rPr>
-              <w:t xml:space="preserve">void patchProfile(int userId, PatchProfileDTO dto)</w:t>
+              <w:t xml:space="preserve">void patchProfile(Long userId, PatchProfileDTO dto)</w:t>
             </w:r>
             <w:r>
               <w:rPr>
@@ -6419,7 +6443,7 @@
                 <w:szCs w:val="16"/>
                 <w:rtl w:val="0"/>
               </w:rPr>
-              <w:t xml:space="preserve">void updateMainAddress(int userId, int addressId)</w:t>
+              <w:t xml:space="preserve">void updateMainAddress(Long userId, Long addressId)</w:t>
             </w:r>
             <w:r>
               <w:rPr>
@@ -6679,7 +6703,7 @@
                 <w:szCs w:val="16"/>
                 <w:rtl w:val="0"/>
               </w:rPr>
-              <w:t xml:space="preserve">List&lt;Address&gt; getUserAddresses(int userId)</w:t>
+              <w:t xml:space="preserve">List&lt;Address&gt; getUserAddresses(Long userId)</w:t>
             </w:r>
             <w:r>
               <w:rPr>
@@ -6755,7 +6779,7 @@
                 <w:szCs w:val="16"/>
                 <w:rtl w:val="0"/>
               </w:rPr>
-              <w:t xml:space="preserve">Address createAddress(int userId, CreateAddressDTO dto)</w:t>
+              <w:t xml:space="preserve">Address createAddress(Long userId, CreateAddressDTO dto)</w:t>
             </w:r>
             <w:r>
               <w:rPr>
@@ -6831,7 +6855,7 @@
                 <w:szCs w:val="16"/>
                 <w:rtl w:val="0"/>
               </w:rPr>
-              <w:t xml:space="preserve">void deleteAddress(int userId, int addressId)</w:t>
+              <w:t xml:space="preserve">void deleteAddress(Long userId, Long addressId)</w:t>
             </w:r>
             <w:r>
               <w:rPr>
@@ -6907,7 +6931,7 @@
                 <w:szCs w:val="16"/>
                 <w:rtl w:val="0"/>
               </w:rPr>
-              <w:t xml:space="preserve">Address updateAddress(int addressId, PatchAddressDTO dto)</w:t>
+              <w:t xml:space="preserve">Address updateAddress(Long addressId, PatchAddressDTO dto)</w:t>
             </w:r>
             <w:r>
               <w:rPr>
@@ -7260,7 +7284,7 @@
                 <w:szCs w:val="16"/>
                 <w:rtl w:val="0"/>
               </w:rPr>
-              <w:t xml:space="preserve">OffererProfilePublicDTO getPublicProfile(int userId)</w:t>
+              <w:t xml:space="preserve">OffererProfilePublicDTO getPublicProfile(Long userId)</w:t>
             </w:r>
             <w:r>
               <w:rPr>
@@ -7336,7 +7360,7 @@
                 <w:szCs w:val="16"/>
                 <w:rtl w:val="0"/>
               </w:rPr>
-              <w:t xml:space="preserve">OffererProfileSummaryDTO getProfileSummary(int userId)</w:t>
+              <w:t xml:space="preserve">OffererProfileSummaryDTO getProfileSummary(Long userId)</w:t>
             </w:r>
             <w:r>
               <w:rPr>
@@ -7412,7 +7436,7 @@
                 <w:szCs w:val="16"/>
                 <w:rtl w:val="0"/>
               </w:rPr>
-              <w:t xml:space="preserve">void patchOffererProfile(int userId, PatchOffererProfileDTO dto)</w:t>
+              <w:t xml:space="preserve">void patchOffererProfile(Long userId, PatchOffererProfileDTO dto)</w:t>
             </w:r>
             <w:r>
               <w:rPr>
@@ -7637,7 +7661,7 @@
                 <w:szCs w:val="16"/>
                 <w:rtl w:val="0"/>
               </w:rPr>
-              <w:t xml:space="preserve">List&lt;OffererAvailability&gt; getSchedule(int offererId)</w:t>
+              <w:t xml:space="preserve">List&lt;OffererAvailability&gt; getSchedule(Long offererId)</w:t>
             </w:r>
             <w:r>
               <w:rPr>
@@ -7713,7 +7737,7 @@
                 <w:szCs w:val="16"/>
                 <w:rtl w:val="0"/>
               </w:rPr>
-              <w:t xml:space="preserve">void setSchedule(int offererId, List&lt;SlotDTO&gt; slots)</w:t>
+              <w:t xml:space="preserve">void setSchedule(Long offererId, List&lt;SlotDTO&gt; slots)</w:t>
             </w:r>
             <w:r>
               <w:rPr>
@@ -7789,7 +7813,7 @@
                 <w:szCs w:val="16"/>
                 <w:rtl w:val="0"/>
               </w:rPr>
-              <w:t xml:space="preserve">void deleteSlot(int slotId)</w:t>
+              <w:t xml:space="preserve">void deleteSlot(Long slotId)</w:t>
             </w:r>
             <w:r>
               <w:rPr>
@@ -7865,7 +7889,7 @@
                 <w:szCs w:val="16"/>
                 <w:rtl w:val="0"/>
               </w:rPr>
-              <w:t xml:space="preserve">void activateSlot(int slotId)</w:t>
+              <w:t xml:space="preserve">void activateSlot(Long slotId)</w:t>
             </w:r>
             <w:r>
               <w:rPr>
@@ -7941,7 +7965,7 @@
                 <w:szCs w:val="16"/>
                 <w:rtl w:val="0"/>
               </w:rPr>
-              <w:t xml:space="preserve">void deactivateSlot(int slotId)</w:t>
+              <w:t xml:space="preserve">void deactivateSlot(Long slotId)</w:t>
             </w:r>
             <w:r>
               <w:rPr>
@@ -8004,7 +8028,7 @@
         <w:spacing w:after="120" w:before="360" w:lineRule="auto"/>
         <w:rPr/>
       </w:pPr>
-      <w:bookmarkStart w:colFirst="0" w:colLast="0" w:name="_3dwwdrpzj58e" w:id="6"/>
+      <w:bookmarkStart w:colFirst="0" w:colLast="0" w:name="_azh2lau2qkws" w:id="6"/>
       <w:bookmarkEnd w:id="6"/>
       <w:r>
         <w:rPr>
@@ -8404,7 +8428,7 @@
                 <w:szCs w:val="16"/>
                 <w:rtl w:val="0"/>
               </w:rPr>
-              <w:t xml:space="preserve">ServiceSummaryDTO getServiceSummary(int serviceId)</w:t>
+              <w:t xml:space="preserve">ServiceSummaryDTO getServiceSummary(Long serviceId)</w:t>
             </w:r>
             <w:r>
               <w:rPr>
@@ -8480,7 +8504,7 @@
                 <w:szCs w:val="16"/>
                 <w:rtl w:val="0"/>
               </w:rPr>
-              <w:t xml:space="preserve">ServiceDetailDTO getServiceDetail(int serviceId)</w:t>
+              <w:t xml:space="preserve">ServiceDetailDTO getServiceDetail(Long serviceId)</w:t>
             </w:r>
             <w:r>
               <w:rPr>
@@ -8556,7 +8580,7 @@
                 <w:szCs w:val="16"/>
                 <w:rtl w:val="0"/>
               </w:rPr>
-              <w:t xml:space="preserve">List&lt;ServiceSummaryDTO&gt; getServicesByOfferer(int offererId)</w:t>
+              <w:t xml:space="preserve">List&lt;ServiceSummaryDTO&gt; getServicesByOfferer(Long offererId)</w:t>
             </w:r>
             <w:r>
               <w:rPr>
@@ -8632,7 +8656,7 @@
                 <w:szCs w:val="16"/>
                 <w:rtl w:val="0"/>
               </w:rPr>
-              <w:t xml:space="preserve">int countServicesByOfferer(int offererId)</w:t>
+              <w:t xml:space="preserve">int countServicesByOfferer(Long offererId)</w:t>
             </w:r>
             <w:r>
               <w:rPr>
@@ -8892,7 +8916,7 @@
                 <w:szCs w:val="16"/>
                 <w:rtl w:val="0"/>
               </w:rPr>
-              <w:t xml:space="preserve">Service createService(int offererId, CreateServiceDTO dto)</w:t>
+              <w:t xml:space="preserve">Service createService(Long offererId, CreateServiceDTO dto)</w:t>
             </w:r>
             <w:r>
               <w:rPr>
@@ -8968,7 +8992,7 @@
                 <w:szCs w:val="16"/>
                 <w:rtl w:val="0"/>
               </w:rPr>
-              <w:t xml:space="preserve">void deleteService(int serviceId)</w:t>
+              <w:t xml:space="preserve">void deleteService(Long serviceId)</w:t>
             </w:r>
             <w:r>
               <w:rPr>
@@ -9044,7 +9068,7 @@
                 <w:szCs w:val="16"/>
                 <w:rtl w:val="0"/>
               </w:rPr>
-              <w:t xml:space="preserve">void deactivateAllByOfferer(int offererId)</w:t>
+              <w:t xml:space="preserve">void deactivateAllByOfferer(Long offererId)</w:t>
             </w:r>
             <w:r>
               <w:rPr>
@@ -9120,7 +9144,7 @@
                 <w:szCs w:val="16"/>
                 <w:rtl w:val="0"/>
               </w:rPr>
-              <w:t xml:space="preserve">void activateService(int serviceId)</w:t>
+              <w:t xml:space="preserve">void activateService(Long serviceId)</w:t>
             </w:r>
             <w:r>
               <w:rPr>
@@ -9196,7 +9220,7 @@
                 <w:szCs w:val="16"/>
                 <w:rtl w:val="0"/>
               </w:rPr>
-              <w:t xml:space="preserve">void deactivateService(int serviceId)</w:t>
+              <w:t xml:space="preserve">void deactivateService(Long serviceId)</w:t>
             </w:r>
             <w:r>
               <w:rPr>
@@ -9272,7 +9296,7 @@
                 <w:szCs w:val="16"/>
                 <w:rtl w:val="0"/>
               </w:rPr>
-              <w:t xml:space="preserve">void patchService(int serviceId, PatchServiceDTO dto)</w:t>
+              <w:t xml:space="preserve">void patchService(Long serviceId, PatchServiceDTO dto)</w:t>
             </w:r>
             <w:r>
               <w:rPr>
@@ -9757,7 +9781,7 @@
                 <w:szCs w:val="16"/>
                 <w:rtl w:val="0"/>
               </w:rPr>
-              <w:t xml:space="preserve">List&lt;ServiceAvailability&gt; getServiceSchedule(int serviceId)</w:t>
+              <w:t xml:space="preserve">List&lt;ServiceAvailability&gt; getServiceSchedule(Long serviceId)</w:t>
             </w:r>
             <w:r>
               <w:rPr>
@@ -9833,7 +9857,7 @@
                 <w:szCs w:val="16"/>
                 <w:rtl w:val="0"/>
               </w:rPr>
-              <w:t xml:space="preserve">void setServiceSchedule(int serviceId, List&lt;SlotDTO&gt; slots)</w:t>
+              <w:t xml:space="preserve">void setServiceSchedule(Long serviceId, List&lt;SlotDTO&gt; slots)</w:t>
             </w:r>
             <w:r>
               <w:rPr>
@@ -9909,7 +9933,7 @@
                 <w:szCs w:val="16"/>
                 <w:rtl w:val="0"/>
               </w:rPr>
-              <w:t xml:space="preserve">void deleteSlot(int slotId)</w:t>
+              <w:t xml:space="preserve">void deleteSlot(Long slotId)</w:t>
             </w:r>
             <w:r>
               <w:rPr>
@@ -9985,7 +10009,7 @@
                 <w:szCs w:val="16"/>
                 <w:rtl w:val="0"/>
               </w:rPr>
-              <w:t xml:space="preserve">void activateSlot(int slotId)</w:t>
+              <w:t xml:space="preserve">void activateSlot(Long slotId)</w:t>
             </w:r>
             <w:r>
               <w:rPr>
@@ -10061,7 +10085,7 @@
                 <w:szCs w:val="16"/>
                 <w:rtl w:val="0"/>
               </w:rPr>
-              <w:t xml:space="preserve">void deactivateSlot(int slotId)</w:t>
+              <w:t xml:space="preserve">void deactivateSlot(Long slotId)</w:t>
             </w:r>
             <w:r>
               <w:rPr>
@@ -10133,7 +10157,7 @@
                 <w:szCs w:val="16"/>
                 <w:rtl w:val="0"/>
               </w:rPr>
-              <w:t xml:space="preserve">void applyOffererTemplate(int serviceId, int offererId)</w:t>
+              <w:t xml:space="preserve">void applyOffererTemplate(Long serviceId, Long offererId)</w:t>
             </w:r>
             <w:r>
               <w:rPr>
@@ -10191,7 +10215,7 @@
         <w:spacing w:after="120" w:before="360" w:lineRule="auto"/>
         <w:rPr/>
       </w:pPr>
-      <w:bookmarkStart w:colFirst="0" w:colLast="0" w:name="_f8x6mcvr4qtu" w:id="7"/>
+      <w:bookmarkStart w:colFirst="0" w:colLast="0" w:name="_vyesjjhypkqi" w:id="7"/>
       <w:bookmarkEnd w:id="7"/>
       <w:r>
         <w:rPr>
@@ -10497,7 +10521,7 @@
                 <w:szCs w:val="16"/>
                 <w:rtl w:val="0"/>
               </w:rPr>
-              <w:t xml:space="preserve">Page&lt;ServiceRequestDTO&gt; getClientRequests(int clientId, List&lt;String&gt; statuses, Pageable pageable)</w:t>
+              <w:t xml:space="preserve">Page&lt;ServiceRequestDTO&gt; getClientRequests(Long clientId, List&lt;String&gt; statuses, Pageable pageable)</w:t>
             </w:r>
             <w:r>
               <w:rPr>
@@ -10573,7 +10597,7 @@
                 <w:szCs w:val="16"/>
                 <w:rtl w:val="0"/>
               </w:rPr>
-              <w:t xml:space="preserve">Page&lt;ServiceRequestDTO&gt; getOffererRequests(int offererId, List&lt;String&gt; statuses, Pageable pageable)</w:t>
+              <w:t xml:space="preserve">Page&lt;ServiceRequestDTO&gt; getOffererRequests(Long offererId, List&lt;String&gt; statuses, Pageable pageable)</w:t>
             </w:r>
             <w:r>
               <w:rPr>
@@ -10649,7 +10673,7 @@
                 <w:szCs w:val="16"/>
                 <w:rtl w:val="0"/>
               </w:rPr>
-              <w:t xml:space="preserve">ServiceRequestDetailDTO getRequestDetailForParty(int requestId, int requesterId)</w:t>
+              <w:t xml:space="preserve">ServiceRequestDetailDTO getRequestDetailForParty(Long requestId, Long requesterId)</w:t>
             </w:r>
             <w:r>
               <w:rPr>
@@ -10725,7 +10749,7 @@
                 <w:szCs w:val="16"/>
                 <w:rtl w:val="0"/>
               </w:rPr>
-              <w:t xml:space="preserve">AdminRequestDetailDTO getRequestDetailForAdmin(int requestId)</w:t>
+              <w:t xml:space="preserve">AdminRequestDetailDTO getRequestDetailForAdmin(Long requestId)</w:t>
             </w:r>
             <w:r>
               <w:rPr>
@@ -10801,7 +10825,7 @@
                 <w:szCs w:val="16"/>
                 <w:rtl w:val="0"/>
               </w:rPr>
-              <w:t xml:space="preserve">List&lt;RequestHistoryDTO&gt; getRequestHistory(int requestId)</w:t>
+              <w:t xml:space="preserve">List&lt;RequestHistoryDTO&gt; getRequestHistory(Long requestId)</w:t>
             </w:r>
             <w:r>
               <w:rPr>
@@ -10877,7 +10901,7 @@
                 <w:szCs w:val="16"/>
                 <w:rtl w:val="0"/>
               </w:rPr>
-              <w:t xml:space="preserve">int countClientRequests(int clientId)</w:t>
+              <w:t xml:space="preserve">int countClientRequests(Long clientId)</w:t>
             </w:r>
             <w:r>
               <w:rPr>
@@ -10953,7 +10977,7 @@
                 <w:szCs w:val="16"/>
                 <w:rtl w:val="0"/>
               </w:rPr>
-              <w:t xml:space="preserve">int countOffererRequests(int offererId)</w:t>
+              <w:t xml:space="preserve">int countOffererRequests(Long offererId)</w:t>
             </w:r>
             <w:r>
               <w:rPr>
@@ -11189,7 +11213,7 @@
                 <w:szCs w:val="16"/>
                 <w:rtl w:val="0"/>
               </w:rPr>
-              <w:t xml:space="preserve">ServiceRequest createRequest(int clientId, int serviceId, int addressId, LocalDateTime scheduledDate)</w:t>
+              <w:t xml:space="preserve">ServiceRequest createRequest(Long clientId, Long serviceId, Long addressId, LocalDateTime scheduledDate)</w:t>
             </w:r>
             <w:r>
               <w:rPr>
@@ -11265,7 +11289,7 @@
                 <w:szCs w:val="16"/>
                 <w:rtl w:val="0"/>
               </w:rPr>
-              <w:t xml:space="preserve">boolean checkServiceAvailability(int serviceId, LocalDateTime scheduledDate)</w:t>
+              <w:t xml:space="preserve">boolean checkServiceAvailability(Long serviceId, LocalDateTime scheduledDate)</w:t>
             </w:r>
             <w:r>
               <w:rPr>
@@ -11341,7 +11365,7 @@
                 <w:szCs w:val="16"/>
                 <w:rtl w:val="0"/>
               </w:rPr>
-              <w:t xml:space="preserve">boolean checkWithinRadius(int serviceId, int clientAddressId)</w:t>
+              <w:t xml:space="preserve">boolean checkWithinRadius(Long serviceId, Long clientAddressId)</w:t>
             </w:r>
             <w:r>
               <w:rPr>
@@ -11417,7 +11441,7 @@
                 <w:szCs w:val="16"/>
                 <w:rtl w:val="0"/>
               </w:rPr>
-              <w:t xml:space="preserve">void acceptRequest(int requestId, int offererId)</w:t>
+              <w:t xml:space="preserve">void acceptRequest(Long requestId, Long offererId)</w:t>
             </w:r>
             <w:r>
               <w:rPr>
@@ -11493,7 +11517,7 @@
                 <w:szCs w:val="16"/>
                 <w:rtl w:val="0"/>
               </w:rPr>
-              <w:t xml:space="preserve">void rejectRequest(int requestId, int offererId)</w:t>
+              <w:t xml:space="preserve">void rejectRequest(Long requestId, Long offererId)</w:t>
             </w:r>
             <w:r>
               <w:rPr>
@@ -11569,7 +11593,7 @@
                 <w:szCs w:val="16"/>
                 <w:rtl w:val="0"/>
               </w:rPr>
-              <w:t xml:space="preserve">void markAsPresumablyCompleted(int requestId, int offererId)</w:t>
+              <w:t xml:space="preserve">void markAsPresumablyCompleted(Long requestId, Long offererId)</w:t>
             </w:r>
             <w:r>
               <w:rPr>
@@ -11645,7 +11669,7 @@
                 <w:szCs w:val="16"/>
                 <w:rtl w:val="0"/>
               </w:rPr>
-              <w:t xml:space="preserve">void confirmCompletion(int requestId, int clientId)</w:t>
+              <w:t xml:space="preserve">void confirmCompletion(Long requestId, Long clientId)</w:t>
             </w:r>
             <w:r>
               <w:rPr>
@@ -11721,7 +11745,7 @@
                 <w:szCs w:val="16"/>
                 <w:rtl w:val="0"/>
               </w:rPr>
-              <w:t xml:space="preserve">void markAsNotProvided(int requestId, int userId)</w:t>
+              <w:t xml:space="preserve">void markAsNotProvided(Long requestId, Long userId)</w:t>
             </w:r>
             <w:r>
               <w:rPr>
@@ -11797,7 +11821,7 @@
                 <w:szCs w:val="16"/>
                 <w:rtl w:val="0"/>
               </w:rPr>
-              <w:t xml:space="preserve">void cancelRequest(int requestId, int userId)</w:t>
+              <w:t xml:space="preserve">void cancelRequest(Long requestId, Long userId)</w:t>
             </w:r>
             <w:r>
               <w:rPr>
@@ -11873,7 +11897,7 @@
                 <w:szCs w:val="16"/>
                 <w:rtl w:val="0"/>
               </w:rPr>
-              <w:t xml:space="preserve">ServiceRequest rescheduleRequest(int requestId, LocalDateTime newDate)</w:t>
+              <w:t xml:space="preserve">ServiceRequest rescheduleRequest(Long requestId, LocalDateTime newDate)</w:t>
             </w:r>
             <w:r>
               <w:rPr>
@@ -12240,7 +12264,7 @@
                 <w:szCs w:val="16"/>
                 <w:rtl w:val="0"/>
               </w:rPr>
-              <w:t xml:space="preserve">RescheduleProposal createProposal(int requestId, int offererId, String reason, LocalDateTime proposedDate)</w:t>
+              <w:t xml:space="preserve">RescheduleProposal createProposal(Long requestId, Long offererId, String reason, LocalDateTime proposedDate)</w:t>
             </w:r>
             <w:r>
               <w:rPr>
@@ -12316,7 +12340,7 @@
                 <w:szCs w:val="16"/>
                 <w:rtl w:val="0"/>
               </w:rPr>
-              <w:t xml:space="preserve">ServiceRequest acceptProposal(int proposalId, int clientId, LocalDateTime confirmedDate)</w:t>
+              <w:t xml:space="preserve">ServiceRequest acceptProposal(Long proposalId, Long clientId, LocalDateTime confirmedDate)</w:t>
             </w:r>
             <w:r>
               <w:rPr>
@@ -12392,7 +12416,7 @@
                 <w:szCs w:val="16"/>
                 <w:rtl w:val="0"/>
               </w:rPr>
-              <w:t xml:space="preserve">void rejectProposal(int proposalId, int clientId)</w:t>
+              <w:t xml:space="preserve">void rejectProposal(Long proposalId, Long clientId)</w:t>
             </w:r>
             <w:r>
               <w:rPr>
@@ -12468,7 +12492,7 @@
                 <w:szCs w:val="16"/>
                 <w:rtl w:val="0"/>
               </w:rPr>
-              <w:t xml:space="preserve">void cancelProposal(int proposalId, int offererId)</w:t>
+              <w:t xml:space="preserve">void cancelProposal(Long proposalId, Long offererId)</w:t>
             </w:r>
             <w:r>
               <w:rPr>
@@ -12544,7 +12568,7 @@
                 <w:szCs w:val="16"/>
                 <w:rtl w:val="0"/>
               </w:rPr>
-              <w:t xml:space="preserve">List&lt;RescheduleProposalDTO&gt; getProposalsForClient(int clientId, List&lt;String&gt; statuses)</w:t>
+              <w:t xml:space="preserve">List&lt;RescheduleProposalDTO&gt; getProposalsForClient(Long clientId, List&lt;String&gt; statuses)</w:t>
             </w:r>
             <w:r>
               <w:rPr>
@@ -12620,7 +12644,7 @@
                 <w:szCs w:val="16"/>
                 <w:rtl w:val="0"/>
               </w:rPr>
-              <w:t xml:space="preserve">List&lt;RescheduleProposalDTO&gt; getProposalsByOfferer(int offererId, List&lt;String&gt; statuses)</w:t>
+              <w:t xml:space="preserve">List&lt;RescheduleProposalDTO&gt; getProposalsByOfferer(Long offererId, List&lt;String&gt; statuses)</w:t>
             </w:r>
             <w:r>
               <w:rPr>
@@ -12696,7 +12720,7 @@
                 <w:szCs w:val="16"/>
                 <w:rtl w:val="0"/>
               </w:rPr>
-              <w:t xml:space="preserve">List&lt;RescheduleProposalDTO&gt; getProposalsByRequest(int requestId)</w:t>
+              <w:t xml:space="preserve">List&lt;RescheduleProposalDTO&gt; getProposalsByRequest(Long requestId)</w:t>
             </w:r>
             <w:r>
               <w:rPr>
@@ -13247,7 +13271,7 @@
         <w:spacing w:after="120" w:before="360" w:lineRule="auto"/>
         <w:rPr/>
       </w:pPr>
-      <w:bookmarkStart w:colFirst="0" w:colLast="0" w:name="_xyz3pcezext6" w:id="8"/>
+      <w:bookmarkStart w:colFirst="0" w:colLast="0" w:name="_2eq57qwhv8gm" w:id="8"/>
       <w:bookmarkEnd w:id="8"/>
       <w:r>
         <w:rPr>
@@ -13431,7 +13455,7 @@
                 <w:szCs w:val="16"/>
                 <w:rtl w:val="0"/>
               </w:rPr>
-              <w:t xml:space="preserve">void submit(FeedbackParts parts, int requestId, Integer rating, ReviewDTO review)</w:t>
+              <w:t xml:space="preserve">void submit(FeedbackParts parts, Long requestId, Integer rating, ReviewDTO review)</w:t>
             </w:r>
             <w:r>
               <w:rPr>
@@ -13498,7 +13522,7 @@
                 <w:szCs w:val="16"/>
                 <w:rtl w:val="0"/>
               </w:rPr>
-              <w:t xml:space="preserve">void remove(FeedbackParts parts, int requestId)</w:t>
+              <w:t xml:space="preserve">void remove(FeedbackParts parts, Long requestId)</w:t>
             </w:r>
             <w:r>
               <w:rPr>
@@ -13766,7 +13790,7 @@
                 <w:szCs w:val="16"/>
                 <w:rtl w:val="0"/>
               </w:rPr>
-              <w:t xml:space="preserve">void submitServiceFeedback(int clientId, int requestId, Integer rating, ReviewDTO review)</w:t>
+              <w:t xml:space="preserve">void submitServiceFeedback(Long clientId, Long requestId, Integer rating, ReviewDTO review)</w:t>
             </w:r>
             <w:r>
               <w:rPr>
@@ -13842,7 +13866,7 @@
                 <w:szCs w:val="16"/>
                 <w:rtl w:val="0"/>
               </w:rPr>
-              <w:t xml:space="preserve">ServiceFeedbackDTO getServiceFeedback(int requestId)</w:t>
+              <w:t xml:space="preserve">ServiceFeedbackDTO getServiceFeedback(Long requestId)</w:t>
             </w:r>
             <w:r>
               <w:rPr>
@@ -13918,7 +13942,7 @@
                 <w:szCs w:val="16"/>
                 <w:rtl w:val="0"/>
               </w:rPr>
-              <w:t xml:space="preserve">Page&lt;ServiceFeedbackDTO&gt; getServiceFeedbackList(int serviceId, Pageable pageable)</w:t>
+              <w:t xml:space="preserve">Page&lt;ServiceFeedbackDTO&gt; getServiceFeedbackList(Long serviceId, Pageable pageable)</w:t>
             </w:r>
             <w:r>
               <w:rPr>
@@ -13990,7 +14014,7 @@
                 <w:szCs w:val="16"/>
                 <w:rtl w:val="0"/>
               </w:rPr>
-              <w:t xml:space="preserve">Page&lt;ServiceFeedbackDTO&gt; getServiceFeedbackByClient(int clientId, Pageable pageable)</w:t>
+              <w:t xml:space="preserve">Page&lt;ServiceFeedbackDTO&gt; getServiceFeedbackByClient(Long clientId, Pageable pageable)</w:t>
             </w:r>
             <w:r>
               <w:rPr>
@@ -14061,7 +14085,7 @@
                 <w:szCs w:val="16"/>
                 <w:rtl w:val="0"/>
               </w:rPr>
-              <w:t xml:space="preserve">boolean revertFeedback(int requestId)</w:t>
+              <w:t xml:space="preserve">boolean revertFeedback(Long requestId)</w:t>
             </w:r>
             <w:r>
               <w:rPr>
@@ -14262,7 +14286,7 @@
                 <w:szCs w:val="16"/>
                 <w:rtl w:val="0"/>
               </w:rPr>
-              <w:t xml:space="preserve">ServiceRating addRating(int clientId, int requestId, int rating)</w:t>
+              <w:t xml:space="preserve">ServiceRating addRating(Long clientId, Long requestId, int rating)</w:t>
             </w:r>
             <w:r>
               <w:rPr>
@@ -14338,7 +14362,7 @@
                 <w:szCs w:val="16"/>
                 <w:rtl w:val="0"/>
               </w:rPr>
-              <w:t xml:space="preserve">void deleteRating(int requestId, int clientId)</w:t>
+              <w:t xml:space="preserve">void deleteRating(Long requestId, Long clientId)</w:t>
             </w:r>
             <w:r>
               <w:rPr>
@@ -14646,7 +14670,7 @@
                 <w:szCs w:val="16"/>
                 <w:rtl w:val="0"/>
               </w:rPr>
-              <w:t xml:space="preserve">ServiceReview createReview(int clientId, int requestId, String comment, List&lt;Integer&gt; tagIds)</w:t>
+              <w:t xml:space="preserve">ServiceReview createReview(Long clientId, Long requestId, String comment, List&lt;Long&gt; tagIds)</w:t>
             </w:r>
             <w:r>
               <w:rPr>
@@ -14722,7 +14746,7 @@
                 <w:szCs w:val="16"/>
                 <w:rtl w:val="0"/>
               </w:rPr>
-              <w:t xml:space="preserve">void deleteReview(int requestId, int clientId)</w:t>
+              <w:t xml:space="preserve">void deleteReview(Long requestId, Long clientId)</w:t>
             </w:r>
             <w:r>
               <w:rPr>
@@ -15207,7 +15231,7 @@
                 <w:szCs w:val="16"/>
                 <w:rtl w:val="0"/>
               </w:rPr>
-              <w:t xml:space="preserve">void submitClientFeedback(int offererId, int requestId, int clientId, Integer rating, ReviewDTO review)</w:t>
+              <w:t xml:space="preserve">void submitClientFeedback(Long offererId, Long requestId, Long clientId, Integer rating, ReviewDTO review)</w:t>
             </w:r>
             <w:r>
               <w:rPr>
@@ -15283,7 +15307,7 @@
                 <w:szCs w:val="16"/>
                 <w:rtl w:val="0"/>
               </w:rPr>
-              <w:t xml:space="preserve">ClientFeedbackDTO getClientFeedback(int requestId)</w:t>
+              <w:t xml:space="preserve">ClientFeedbackDTO getClientFeedback(Long requestId)</w:t>
             </w:r>
             <w:r>
               <w:rPr>
@@ -15359,7 +15383,7 @@
                 <w:szCs w:val="16"/>
                 <w:rtl w:val="0"/>
               </w:rPr>
-              <w:t xml:space="preserve">Page&lt;ClientFeedbackDTO&gt; getClientFeedbackList(int clientId, Pageable pageable)</w:t>
+              <w:t xml:space="preserve">Page&lt;ClientFeedbackDTO&gt; getClientFeedbackList(Long clientId, Pageable pageable)</w:t>
             </w:r>
             <w:r>
               <w:rPr>
@@ -15431,7 +15455,7 @@
                 <w:szCs w:val="16"/>
                 <w:rtl w:val="0"/>
               </w:rPr>
-              <w:t xml:space="preserve">Page&lt;ClientFeedbackDTO&gt; getClientFeedbackByOfferer(int offererId, Pageable pageable)</w:t>
+              <w:t xml:space="preserve">Page&lt;ClientFeedbackDTO&gt; getClientFeedbackByOfferer(Long offererId, Pageable pageable)</w:t>
             </w:r>
             <w:r>
               <w:rPr>
@@ -15502,7 +15526,7 @@
                 <w:szCs w:val="16"/>
                 <w:rtl w:val="0"/>
               </w:rPr>
-              <w:t xml:space="preserve">boolean revertFeedback(int requestId)</w:t>
+              <w:t xml:space="preserve">boolean revertFeedback(Long requestId)</w:t>
             </w:r>
             <w:r>
               <w:rPr>
@@ -15703,7 +15727,7 @@
                 <w:szCs w:val="16"/>
                 <w:rtl w:val="0"/>
               </w:rPr>
-              <w:t xml:space="preserve">ClientRating addRating(int offererId, int requestId, int clientId, int rating)</w:t>
+              <w:t xml:space="preserve">ClientRating addRating(Long offererId, Long requestId, Long clientId, int rating)</w:t>
             </w:r>
             <w:r>
               <w:rPr>
@@ -15779,7 +15803,7 @@
                 <w:szCs w:val="16"/>
                 <w:rtl w:val="0"/>
               </w:rPr>
-              <w:t xml:space="preserve">void deleteRating(int requestId, int offererId)</w:t>
+              <w:t xml:space="preserve">void deleteRating(Long requestId, Long offererId)</w:t>
             </w:r>
             <w:r>
               <w:rPr>
@@ -15980,7 +16004,7 @@
                 <w:szCs w:val="16"/>
                 <w:rtl w:val="0"/>
               </w:rPr>
-              <w:t xml:space="preserve">ClientReview createReview(int offererId, int requestId, String comment, List&lt;Integer&gt; tagIds)</w:t>
+              <w:t xml:space="preserve">ClientReview createReview(Long offererId, Long requestId, String comment, List&lt;Long&gt; tagIds)</w:t>
             </w:r>
             <w:r>
               <w:rPr>
@@ -16056,7 +16080,7 @@
                 <w:szCs w:val="16"/>
                 <w:rtl w:val="0"/>
               </w:rPr>
-              <w:t xml:space="preserve">void deleteReview(int requestId, int offererId)</w:t>
+              <w:t xml:space="preserve">void deleteReview(Long requestId, Long offererId)</w:t>
             </w:r>
             <w:r>
               <w:rPr>
@@ -16320,7 +16344,7 @@
         <w:spacing w:after="120" w:before="360" w:lineRule="auto"/>
         <w:rPr/>
       </w:pPr>
-      <w:bookmarkStart w:colFirst="0" w:colLast="0" w:name="_4uxuz1tiw5hn" w:id="9"/>
+      <w:bookmarkStart w:colFirst="0" w:colLast="0" w:name="_c293sqxmr4jr" w:id="9"/>
       <w:bookmarkEnd w:id="9"/>
       <w:r>
         <w:rPr>
@@ -16663,7 +16687,7 @@
                 <w:szCs w:val="16"/>
                 <w:rtl w:val="0"/>
               </w:rPr>
-              <w:t xml:space="preserve">ServiceMetrics getMetrics(int serviceId)</w:t>
+              <w:t xml:space="preserve">ServiceMetrics getMetrics(Long serviceId)</w:t>
             </w:r>
             <w:r>
               <w:rPr>
@@ -17150,7 +17174,7 @@
                 <w:szCs w:val="16"/>
                 <w:rtl w:val="0"/>
               </w:rPr>
-              <w:t xml:space="preserve">List&lt;ServiceTagMetrics&gt; getTagMetrics(int serviceId)</w:t>
+              <w:t xml:space="preserve">List&lt;ServiceTagMetrics&gt; getTagMetrics(Long serviceId)</w:t>
             </w:r>
             <w:r>
               <w:rPr>
@@ -17503,7 +17527,7 @@
                 <w:szCs w:val="16"/>
                 <w:rtl w:val="0"/>
               </w:rPr>
-              <w:t xml:space="preserve">OffererMetrics getAllMetrics(int offererId)</w:t>
+              <w:t xml:space="preserve">OffererMetrics getAllMetrics(Long offererId)</w:t>
             </w:r>
             <w:r>
               <w:rPr>
@@ -17579,7 +17603,7 @@
                 <w:szCs w:val="16"/>
                 <w:rtl w:val="0"/>
               </w:rPr>
-              <w:t xml:space="preserve">OffererMetricsSummaryDTO getMainMetrics(int offererId)</w:t>
+              <w:t xml:space="preserve">OffererMetricsSummaryDTO getMainMetrics(Long offererId)</w:t>
             </w:r>
             <w:r>
               <w:rPr>
@@ -18142,7 +18166,7 @@
                 <w:szCs w:val="16"/>
                 <w:rtl w:val="0"/>
               </w:rPr>
-              <w:t xml:space="preserve">ClientMetrics getAllMetrics(int clientId)</w:t>
+              <w:t xml:space="preserve">ClientMetrics getAllMetrics(Long clientId)</w:t>
             </w:r>
             <w:r>
               <w:rPr>
@@ -18218,7 +18242,7 @@
                 <w:szCs w:val="16"/>
                 <w:rtl w:val="0"/>
               </w:rPr>
-              <w:t xml:space="preserve">ClientMetricsSummaryDTO getMainMetrics(int clientId)</w:t>
+              <w:t xml:space="preserve">ClientMetricsSummaryDTO getMainMetrics(Long clientId)</w:t>
             </w:r>
             <w:r>
               <w:rPr>
@@ -18781,7 +18805,7 @@
                 <w:szCs w:val="16"/>
                 <w:rtl w:val="0"/>
               </w:rPr>
-              <w:t xml:space="preserve">List&lt;OffererTagMetrics&gt; getTagMetrics(int offererId)</w:t>
+              <w:t xml:space="preserve">List&lt;OffererTagMetrics&gt; getTagMetrics(Long offererId)</w:t>
             </w:r>
             <w:r>
               <w:rPr>
@@ -19134,7 +19158,7 @@
                 <w:szCs w:val="16"/>
                 <w:rtl w:val="0"/>
               </w:rPr>
-              <w:t xml:space="preserve">List&lt;ClientTagMetrics&gt; getTagMetrics(int clientId)</w:t>
+              <w:t xml:space="preserve">List&lt;ClientTagMetrics&gt; getTagMetrics(Long clientId)</w:t>
             </w:r>
             <w:r>
               <w:rPr>
@@ -19349,7 +19373,7 @@
         <w:spacing w:after="120" w:before="360" w:lineRule="auto"/>
         <w:rPr/>
       </w:pPr>
-      <w:bookmarkStart w:colFirst="0" w:colLast="0" w:name="_8hxe523taxia" w:id="10"/>
+      <w:bookmarkStart w:colFirst="0" w:colLast="0" w:name="_xyfnki45mt04" w:id="10"/>
       <w:bookmarkEnd w:id="10"/>
       <w:r>
         <w:rPr>
@@ -19995,7 +20019,7 @@
                 <w:szCs w:val="16"/>
                 <w:rtl w:val="0"/>
               </w:rPr>
-              <w:t xml:space="preserve">Report createBaseReport(int reporterId, int reportedUserId, String type, String category, String reason)</w:t>
+              <w:t xml:space="preserve">Report createBaseReport(Long reporterId, Long reportedUserId, String type, String category, String reason)</w:t>
             </w:r>
             <w:r>
               <w:rPr>
@@ -20071,7 +20095,7 @@
                 <w:szCs w:val="16"/>
                 <w:rtl w:val="0"/>
               </w:rPr>
-              <w:t xml:space="preserve">ReportDetailDTO getReportDetail(int reportId)</w:t>
+              <w:t xml:space="preserve">ReportDetailDTO getReportDetail(Long reportId)</w:t>
             </w:r>
             <w:r>
               <w:rPr>
@@ -20223,7 +20247,7 @@
                 <w:szCs w:val="16"/>
                 <w:rtl w:val="0"/>
               </w:rPr>
-              <w:t xml:space="preserve">List&lt;ReportDTO&gt; getReportsByReporter(int reporterId)</w:t>
+              <w:t xml:space="preserve">List&lt;ReportDTO&gt; getReportsByReporter(Long reporterId)</w:t>
             </w:r>
             <w:r>
               <w:rPr>
@@ -20299,7 +20323,7 @@
                 <w:szCs w:val="16"/>
                 <w:rtl w:val="0"/>
               </w:rPr>
-              <w:t xml:space="preserve">List&lt;ReportDTO&gt; getReportsByReportedUser(int reportedUserId)</w:t>
+              <w:t xml:space="preserve">List&lt;ReportDTO&gt; getReportsByReportedUser(Long reportedUserId)</w:t>
             </w:r>
             <w:r>
               <w:rPr>
@@ -20375,7 +20399,7 @@
                 <w:szCs w:val="16"/>
                 <w:rtl w:val="0"/>
               </w:rPr>
-              <w:t xml:space="preserve">int countReportsByReportedUser(int reportedUserId)</w:t>
+              <w:t xml:space="preserve">int countReportsByReportedUser(Long reportedUserId)</w:t>
             </w:r>
             <w:r>
               <w:rPr>
@@ -20451,7 +20475,7 @@
                 <w:szCs w:val="16"/>
                 <w:rtl w:val="0"/>
               </w:rPr>
-              <w:t xml:space="preserve">int countReportsByReporter(int reporterId)</w:t>
+              <w:t xml:space="preserve">int countReportsByReporter(Long reporterId)</w:t>
             </w:r>
             <w:r>
               <w:rPr>
@@ -20687,7 +20711,7 @@
                 <w:szCs w:val="16"/>
                 <w:rtl w:val="0"/>
               </w:rPr>
-              <w:t xml:space="preserve">RequestReport createReport(int reporterId, int reportedUserId, String category, String reason, int requestId)</w:t>
+              <w:t xml:space="preserve">RequestReport createReport(Long reporterId, Long reportedUserId, String category, String reason, Long requestId)</w:t>
             </w:r>
             <w:r>
               <w:rPr>
@@ -20763,7 +20787,7 @@
                 <w:szCs w:val="16"/>
                 <w:rtl w:val="0"/>
               </w:rPr>
-              <w:t xml:space="preserve">RequestReportDetailDTO getReportDetail(int reportId)</w:t>
+              <w:t xml:space="preserve">RequestReportDetailDTO getReportDetail(Long reportId)</w:t>
             </w:r>
             <w:r>
               <w:rPr>
@@ -20964,7 +20988,7 @@
                 <w:szCs w:val="16"/>
                 <w:rtl w:val="0"/>
               </w:rPr>
-              <w:t xml:space="preserve">ServiceReviewReport createReport(int reporterId, int reportedUserId, String category, String reason, int serviceReviewId)</w:t>
+              <w:t xml:space="preserve">ServiceReviewReport createReport(Long reporterId, Long reportedUserId, String category, String reason, Long serviceReviewId)</w:t>
             </w:r>
             <w:r>
               <w:rPr>
@@ -21040,7 +21064,7 @@
                 <w:szCs w:val="16"/>
                 <w:rtl w:val="0"/>
               </w:rPr>
-              <w:t xml:space="preserve">ServiceReviewReportDetailDTO getReportDetail(int reportId)</w:t>
+              <w:t xml:space="preserve">ServiceReviewReportDetailDTO getReportDetail(Long reportId)</w:t>
             </w:r>
             <w:r>
               <w:rPr>
@@ -21241,7 +21265,7 @@
                 <w:szCs w:val="16"/>
                 <w:rtl w:val="0"/>
               </w:rPr>
-              <w:t xml:space="preserve">ClientReviewReport createReport(int reporterId, int reportedUserId, String category, String reason, int clientReviewId)</w:t>
+              <w:t xml:space="preserve">ClientReviewReport createReport(Long reporterId, Long reportedUserId, String category, String reason, Long clientReviewId)</w:t>
             </w:r>
             <w:r>
               <w:rPr>
@@ -21317,7 +21341,7 @@
                 <w:szCs w:val="16"/>
                 <w:rtl w:val="0"/>
               </w:rPr>
-              <w:t xml:space="preserve">ClientReviewReportDetailDTO getReportDetail(int reportId)</w:t>
+              <w:t xml:space="preserve">ClientReviewReportDetailDTO getReportDetail(Long reportId)</w:t>
             </w:r>
             <w:r>
               <w:rPr>
@@ -21518,7 +21542,7 @@
                 <w:szCs w:val="16"/>
                 <w:rtl w:val="0"/>
               </w:rPr>
-              <w:t xml:space="preserve">ReportAction createAction(int reportId, int adminId, String actionTaken)</w:t>
+              <w:t xml:space="preserve">ReportAction createAction(Long reportId, Long adminId, String actionTaken)</w:t>
             </w:r>
             <w:r>
               <w:rPr>
@@ -21594,7 +21618,7 @@
                 <w:szCs w:val="16"/>
                 <w:rtl w:val="0"/>
               </w:rPr>
-              <w:t xml:space="preserve">List&lt;ReportAction&gt; getActionsByReport(int reportId)</w:t>
+              <w:t xml:space="preserve">List&lt;ReportAction&gt; getActionsByReport(Long reportId)</w:t>
             </w:r>
             <w:r>
               <w:rPr>
@@ -21657,7 +21681,7 @@
         <w:spacing w:after="120" w:before="360" w:lineRule="auto"/>
         <w:rPr/>
       </w:pPr>
-      <w:bookmarkStart w:colFirst="0" w:colLast="0" w:name="_be6qgmc86m5e" w:id="11"/>
+      <w:bookmarkStart w:colFirst="0" w:colLast="0" w:name="_1utoskyronph" w:id="11"/>
       <w:bookmarkEnd w:id="11"/>
       <w:r>
         <w:rPr>
@@ -21964,7 +21988,7 @@
                 <w:szCs w:val="16"/>
                 <w:rtl w:val="0"/>
               </w:rPr>
-              <w:t xml:space="preserve">void notify(int userId, String type, String title, String message, String entityType, int entityId, List&lt;Integer&gt; channelIds, Map&lt;String,String&gt; protectedData)</w:t>
+              <w:t xml:space="preserve">void notify(Long userId, String type, String title, String message, String entityType, Long entityId, List&lt;Long&gt; channelIds, Map&lt;String,String&gt; protectedData)</w:t>
             </w:r>
             <w:r>
               <w:rPr>
@@ -22040,7 +22064,7 @@
                 <w:szCs w:val="16"/>
                 <w:rtl w:val="0"/>
               </w:rPr>
-              <w:t xml:space="preserve">Notification createNotification(int userId, String type, String title, String message, String entityType, int entityId)</w:t>
+              <w:t xml:space="preserve">Notification createNotification(Long userId, String type, String title, String message, String entityType, Long entityId)</w:t>
             </w:r>
             <w:r>
               <w:rPr>
@@ -22324,7 +22348,7 @@
                 <w:szCs w:val="16"/>
                 <w:rtl w:val="0"/>
               </w:rPr>
-              <w:t xml:space="preserve">NotificationDelivery deliver(int notificationId, int channelId, Map&lt;String,String&gt; protectedData)</w:t>
+              <w:t xml:space="preserve">NotificationDelivery deliver(Long notificationId, Long channelId, Map&lt;String,String&gt; protectedData)</w:t>
             </w:r>
             <w:r>
               <w:rPr>
@@ -22400,7 +22424,7 @@
                 <w:szCs w:val="16"/>
                 <w:rtl w:val="0"/>
               </w:rPr>
-              <w:t xml:space="preserve">Page&lt;NotificationDeliveryDTO&gt; getDeliveries(int userId, Boolean read, Integer channelId, String status, Pageable pageable)</w:t>
+              <w:t xml:space="preserve">Page&lt;NotificationDeliveryDTO&gt; getDeliveries(Long userId, Boolean read, Integer channelId, String status, Pageable pageable)</w:t>
             </w:r>
             <w:r>
               <w:rPr>
@@ -22476,7 +22500,7 @@
                 <w:szCs w:val="16"/>
                 <w:rtl w:val="0"/>
               </w:rPr>
-              <w:t xml:space="preserve">String getDeliveryStatus(int notificationId, int channelId)</w:t>
+              <w:t xml:space="preserve">String getDeliveryStatus(Long notificationId, Long channelId)</w:t>
             </w:r>
             <w:r>
               <w:rPr>
@@ -22552,7 +22576,7 @@
                 <w:szCs w:val="16"/>
                 <w:rtl w:val="0"/>
               </w:rPr>
-              <w:t xml:space="preserve">boolean isRead(int notificationId, int channelId)</w:t>
+              <w:t xml:space="preserve">boolean isRead(Long notificationId, Long channelId)</w:t>
             </w:r>
             <w:r>
               <w:rPr>
@@ -22628,7 +22652,7 @@
                 <w:szCs w:val="16"/>
                 <w:rtl w:val="0"/>
               </w:rPr>
-              <w:t xml:space="preserve">void markAsRead(int deliveryId)</w:t>
+              <w:t xml:space="preserve">void markAsRead(Long deliveryId)</w:t>
             </w:r>
             <w:r>
               <w:rPr>
@@ -23145,7 +23169,7 @@
                 <w:szCs w:val="16"/>
                 <w:rtl w:val="0"/>
               </w:rPr>
-              <w:t xml:space="preserve">User createUserByAdmin(int adminId, CreateUserDTO dto, String roleName)</w:t>
+              <w:t xml:space="preserve">User createUserByAdmin(Long adminId, CreateUserDTO dto, String roleName)</w:t>
             </w:r>
             <w:r>
               <w:rPr>
@@ -23212,7 +23236,7 @@
                 <w:szCs w:val="16"/>
                 <w:rtl w:val="0"/>
               </w:rPr>
-              <w:t xml:space="preserve">void grantAdminRole(int adminId, int userId)</w:t>
+              <w:t xml:space="preserve">void grantAdminRole(Long adminId, Long userId)</w:t>
             </w:r>
             <w:r>
               <w:rPr>
@@ -23346,7 +23370,7 @@
                 <w:szCs w:val="16"/>
                 <w:rtl w:val="0"/>
               </w:rPr>
-              <w:t xml:space="preserve">UserAdminDetailDTO getUserAdminDetail(int userId)</w:t>
+              <w:t xml:space="preserve">UserAdminDetailDTO getUserAdminDetail(Long userId)</w:t>
             </w:r>
             <w:r>
               <w:rPr>
@@ -23413,7 +23437,7 @@
                 <w:szCs w:val="16"/>
                 <w:rtl w:val="0"/>
               </w:rPr>
-              <w:t xml:space="preserve">void banUser(int adminId, int userId)</w:t>
+              <w:t xml:space="preserve">void banUser(Long adminId, Long userId)</w:t>
             </w:r>
             <w:r>
               <w:rPr>
@@ -23480,7 +23504,7 @@
                 <w:szCs w:val="16"/>
                 <w:rtl w:val="0"/>
               </w:rPr>
-              <w:t xml:space="preserve">void unbanUser(int adminId, int userId)</w:t>
+              <w:t xml:space="preserve">void unbanUser(Long adminId, Long userId)</w:t>
             </w:r>
             <w:r>
               <w:rPr>
@@ -23547,7 +23571,7 @@
                 <w:szCs w:val="16"/>
                 <w:rtl w:val="0"/>
               </w:rPr>
-              <w:t xml:space="preserve">void deleteUser(int adminId, int userId)</w:t>
+              <w:t xml:space="preserve">void deleteUser(Long adminId, Long userId)</w:t>
             </w:r>
             <w:r>
               <w:rPr>
@@ -23776,7 +23800,7 @@
                 <w:szCs w:val="16"/>
                 <w:rtl w:val="0"/>
               </w:rPr>
-              <w:t xml:space="preserve">void warnUser(int reportId, int adminId)</w:t>
+              <w:t xml:space="preserve">void warnUser(Long reportId, Long adminId)</w:t>
             </w:r>
             <w:r>
               <w:rPr>
@@ -23843,7 +23867,7 @@
                 <w:szCs w:val="16"/>
                 <w:rtl w:val="0"/>
               </w:rPr>
-              <w:t xml:space="preserve">void banUserFromReport(int reportId, int adminId)</w:t>
+              <w:t xml:space="preserve">void banUserFromReport(Long reportId, Long adminId)</w:t>
             </w:r>
             <w:r>
               <w:rPr>
@@ -23910,7 +23934,7 @@
                 <w:szCs w:val="16"/>
                 <w:rtl w:val="0"/>
               </w:rPr>
-              <w:t xml:space="preserve">void revertFeedbackFromReport(int reportId, int adminId)</w:t>
+              <w:t xml:space="preserve">void revertFeedbackFromReport(Long reportId, Long adminId)</w:t>
             </w:r>
             <w:r>
               <w:rPr>
@@ -23977,7 +24001,7 @@
                 <w:szCs w:val="16"/>
                 <w:rtl w:val="0"/>
               </w:rPr>
-              <w:t xml:space="preserve">void removeFeedbackDirectly(int adminId, CreateReportDTO reportData)</w:t>
+              <w:t xml:space="preserve">void removeFeedbackDirectly(Long adminId, CreateReportDTO reportData)</w:t>
             </w:r>
             <w:r>
               <w:rPr>
@@ -24044,7 +24068,7 @@
                 <w:szCs w:val="16"/>
                 <w:rtl w:val="0"/>
               </w:rPr>
-              <w:t xml:space="preserve">void markRequestAsNotProvided(int reportId, int adminId)</w:t>
+              <w:t xml:space="preserve">void markRequestAsNotProvided(Long reportId, Long adminId)</w:t>
             </w:r>
             <w:r>
               <w:rPr>
@@ -24111,7 +24135,7 @@
                 <w:szCs w:val="16"/>
                 <w:rtl w:val="0"/>
               </w:rPr>
-              <w:t xml:space="preserve">void closeReport(int reportId, int adminId)</w:t>
+              <w:t xml:space="preserve">void closeReport(Long reportId, Long adminId)</w:t>
             </w:r>
             <w:r>
               <w:rPr>
@@ -24178,7 +24202,7 @@
                 <w:szCs w:val="16"/>
                 <w:rtl w:val="0"/>
               </w:rPr>
-              <w:t xml:space="preserve">private void finalizeReport(int reportId, int adminId, String actionText)</w:t>
+              <w:t xml:space="preserve">private void finalizeReport(Long reportId, Long adminId, String actionText)</w:t>
             </w:r>
             <w:r>
               <w:rPr>

</xml_diff>